<commit_message>
docs: add high-res architecture, lifecycle, app flow and migration diagrams into Word and PDF documentation
</commit_message>
<xml_diff>
--- a/DOCUMENTO_FINAL_PRESTAMOS_CLOUD.docx
+++ b/DOCUMENTO_FINAL_PRESTAMOS_CLOUD.docx
@@ -9,7 +9,7 @@
       <w:r>
         <w:drawing>
           <wp:inline xmlns:a="http://schemas.openxmlformats.org/drawingml/2006/main" xmlns:pic="http://schemas.openxmlformats.org/drawingml/2006/picture">
-            <wp:extent cx="1463040" cy="1463040"/>
+            <wp:extent cx="1645920" cy="1645920"/>
             <wp:docPr id="1" name="Picture 1"/>
             <wp:cNvGraphicFramePr>
               <a:graphicFrameLocks noChangeAspect="1"/>
@@ -30,7 +30,7 @@
                   <pic:spPr>
                     <a:xfrm>
                       <a:off x="0" y="0"/>
-                      <a:ext cx="1463040" cy="1463040"/>
+                      <a:ext cx="1645920" cy="1645920"/>
                     </a:xfrm>
                     <a:prstGeom prst="rect"/>
                   </pic:spPr>
@@ -43,6 +43,7 @@
     </w:p>
     <w:p>
       <w:pPr>
+        <w:spacing w:before="200"/>
         <w:jc w:val="center"/>
       </w:pPr>
       <w:r>
@@ -53,7 +54,7 @@
         </w:rPr>
         <w:t>INGENIERÍA DE SISTEMAS E INFORMÁTICA</w:t>
         <w:br/>
-        <w:t>GESTIÓN DE PROYECTOS DE TI Y ARQUITECTURA CLOUD</w:t>
+        <w:t>GESTIÓN DE PROYECTOS DE TI / ARQUITECTURA DE SOFTWARE Y CLOUD</w:t>
       </w:r>
     </w:p>
     <w:p>
@@ -69,11 +70,11 @@
         <w:rPr>
           <w:b/>
           <w:color w:val="0F172A"/>
-          <w:sz w:val="36"/>
+          <w:sz w:val="34"/>
         </w:rPr>
-        <w:t>TRABAJO ENCARGADO:</w:t>
+        <w:t>INFORME TÉCNICO Y MANUAL DE FUNCIONAMIENTO:</w:t>
         <w:br/>
-        <w:t>PLATAFORMA WEB FINTECH DE PRÉSTAMOS RÁPIDOS Y PLAN DE MIGRACIÓN DE BASE DE DATOS A LA NUBE (AWS RDS)</w:t>
+        <w:t>PLATAFORMA FINTECH DE PRÉSTAMOS RÁPIDOS Y MIGRACIÓN DE BASE DE DATOS A LA NUBE (AWS RDS)</w:t>
       </w:r>
     </w:p>
     <w:p>
@@ -84,14 +85,13 @@
         <w:rPr>
           <w:i/>
           <w:color w:val="64748B"/>
-          <w:sz w:val="22"/>
+          <w:sz w:val="21"/>
         </w:rPr>
-        <w:t>Manual de Funcionamiento, Arquitectura de Infraestructura, Matriz RACI y Ciclo de Vida del Proyecto</w:t>
+        <w:t>Clasificación de Proyectos TI • Componentes Cloud • Matriz RACI • Ciclo de Vida • Manual de Usuario • Checksums</w:t>
       </w:r>
     </w:p>
     <w:p>
       <w:r>
-        <w:br/>
         <w:br/>
       </w:r>
     </w:p>
@@ -102,19 +102,19 @@
         <w:tblLook w:firstColumn="1" w:firstRow="1" w:lastColumn="0" w:lastRow="0" w:noHBand="0" w:noVBand="1" w:val="04A0"/>
       </w:tblPr>
       <w:tblGrid>
-        <w:gridCol w:w="4680"/>
-        <w:gridCol w:w="4680"/>
+        <w:gridCol w:w="4824"/>
+        <w:gridCol w:w="4824"/>
       </w:tblGrid>
       <w:tr>
         <w:tc>
           <w:tcPr>
-            <w:tcW w:type="dxa" w:w="4680"/>
+            <w:tcW w:type="dxa" w:w="4824"/>
             <w:shd w:fill="F1F5F9"/>
             <w:tcMar>
-              <w:top w:w="80" w:type="dxa"/>
-              <w:bottom w:w="80" w:type="dxa"/>
-              <w:left w:w="120" w:type="dxa"/>
-              <w:right w:w="120" w:type="dxa"/>
+              <w:top w:w="70" w:type="dxa"/>
+              <w:bottom w:w="70" w:type="dxa"/>
+              <w:left w:w="110" w:type="dxa"/>
+              <w:right w:w="110" w:type="dxa"/>
             </w:tcMar>
           </w:tcPr>
           <w:p>
@@ -129,13 +129,13 @@
         </w:tc>
         <w:tc>
           <w:tcPr>
-            <w:tcW w:type="dxa" w:w="4680"/>
+            <w:tcW w:type="dxa" w:w="4824"/>
             <w:shd w:fill="F8FAFC"/>
             <w:tcMar>
-              <w:top w:w="80" w:type="dxa"/>
-              <w:bottom w:w="80" w:type="dxa"/>
-              <w:left w:w="120" w:type="dxa"/>
-              <w:right w:w="120" w:type="dxa"/>
+              <w:top w:w="70" w:type="dxa"/>
+              <w:bottom w:w="70" w:type="dxa"/>
+              <w:left w:w="110" w:type="dxa"/>
+              <w:right w:w="110" w:type="dxa"/>
             </w:tcMar>
           </w:tcPr>
           <w:p>
@@ -148,13 +148,13 @@
       <w:tr>
         <w:tc>
           <w:tcPr>
-            <w:tcW w:type="dxa" w:w="4680"/>
+            <w:tcW w:type="dxa" w:w="4824"/>
             <w:shd w:fill="F1F5F9"/>
             <w:tcMar>
-              <w:top w:w="80" w:type="dxa"/>
-              <w:bottom w:w="80" w:type="dxa"/>
-              <w:left w:w="120" w:type="dxa"/>
-              <w:right w:w="120" w:type="dxa"/>
+              <w:top w:w="70" w:type="dxa"/>
+              <w:bottom w:w="70" w:type="dxa"/>
+              <w:left w:w="110" w:type="dxa"/>
+              <w:right w:w="110" w:type="dxa"/>
             </w:tcMar>
           </w:tcPr>
           <w:p>
@@ -169,13 +169,13 @@
         </w:tc>
         <w:tc>
           <w:tcPr>
-            <w:tcW w:type="dxa" w:w="4680"/>
+            <w:tcW w:type="dxa" w:w="4824"/>
             <w:shd w:fill="F8FAFC"/>
             <w:tcMar>
-              <w:top w:w="80" w:type="dxa"/>
-              <w:bottom w:w="80" w:type="dxa"/>
-              <w:left w:w="120" w:type="dxa"/>
-              <w:right w:w="120" w:type="dxa"/>
+              <w:top w:w="70" w:type="dxa"/>
+              <w:bottom w:w="70" w:type="dxa"/>
+              <w:left w:w="110" w:type="dxa"/>
+              <w:right w:w="110" w:type="dxa"/>
             </w:tcMar>
           </w:tcPr>
           <w:p>
@@ -192,13 +192,13 @@
       <w:tr>
         <w:tc>
           <w:tcPr>
-            <w:tcW w:type="dxa" w:w="4680"/>
+            <w:tcW w:type="dxa" w:w="4824"/>
             <w:shd w:fill="F1F5F9"/>
             <w:tcMar>
-              <w:top w:w="80" w:type="dxa"/>
-              <w:bottom w:w="80" w:type="dxa"/>
-              <w:left w:w="120" w:type="dxa"/>
-              <w:right w:w="120" w:type="dxa"/>
+              <w:top w:w="70" w:type="dxa"/>
+              <w:bottom w:w="70" w:type="dxa"/>
+              <w:left w:w="110" w:type="dxa"/>
+              <w:right w:w="110" w:type="dxa"/>
             </w:tcMar>
           </w:tcPr>
           <w:p>
@@ -213,13 +213,13 @@
         </w:tc>
         <w:tc>
           <w:tcPr>
-            <w:tcW w:type="dxa" w:w="4680"/>
+            <w:tcW w:type="dxa" w:w="4824"/>
             <w:shd w:fill="F8FAFC"/>
             <w:tcMar>
-              <w:top w:w="80" w:type="dxa"/>
-              <w:bottom w:w="80" w:type="dxa"/>
-              <w:left w:w="120" w:type="dxa"/>
-              <w:right w:w="120" w:type="dxa"/>
+              <w:top w:w="70" w:type="dxa"/>
+              <w:bottom w:w="70" w:type="dxa"/>
+              <w:left w:w="110" w:type="dxa"/>
+              <w:right w:w="110" w:type="dxa"/>
             </w:tcMar>
           </w:tcPr>
           <w:p>
@@ -236,13 +236,13 @@
       <w:tr>
         <w:tc>
           <w:tcPr>
-            <w:tcW w:type="dxa" w:w="4680"/>
+            <w:tcW w:type="dxa" w:w="4824"/>
             <w:shd w:fill="F1F5F9"/>
             <w:tcMar>
-              <w:top w:w="80" w:type="dxa"/>
-              <w:bottom w:w="80" w:type="dxa"/>
-              <w:left w:w="120" w:type="dxa"/>
-              <w:right w:w="120" w:type="dxa"/>
+              <w:top w:w="70" w:type="dxa"/>
+              <w:bottom w:w="70" w:type="dxa"/>
+              <w:left w:w="110" w:type="dxa"/>
+              <w:right w:w="110" w:type="dxa"/>
             </w:tcMar>
           </w:tcPr>
           <w:p>
@@ -251,19 +251,19 @@
                 <w:b/>
                 <w:color w:val="1E293B"/>
               </w:rPr>
-              <w:t>Año Académico:</w:t>
+              <w:t>Fecha / Año Académico:</w:t>
             </w:r>
           </w:p>
         </w:tc>
         <w:tc>
           <w:tcPr>
-            <w:tcW w:type="dxa" w:w="4680"/>
+            <w:tcW w:type="dxa" w:w="4824"/>
             <w:shd w:fill="F8FAFC"/>
             <w:tcMar>
-              <w:top w:w="80" w:type="dxa"/>
-              <w:bottom w:w="80" w:type="dxa"/>
-              <w:left w:w="120" w:type="dxa"/>
-              <w:right w:w="120" w:type="dxa"/>
+              <w:top w:w="70" w:type="dxa"/>
+              <w:bottom w:w="70" w:type="dxa"/>
+              <w:left w:w="110" w:type="dxa"/>
+              <w:right w:w="110" w:type="dxa"/>
             </w:tcMar>
           </w:tcPr>
           <w:p>
@@ -372,6 +372,60 @@
       </w:r>
     </w:p>
     <w:p>
+      <w:pPr>
+        <w:spacing w:before="160" w:after="80"/>
+        <w:jc w:val="center"/>
+      </w:pPr>
+      <w:r>
+        <w:drawing>
+          <wp:inline xmlns:a="http://schemas.openxmlformats.org/drawingml/2006/main" xmlns:pic="http://schemas.openxmlformats.org/drawingml/2006/picture">
+            <wp:extent cx="5486400" cy="2852928"/>
+            <wp:docPr id="2" name="Picture 2"/>
+            <wp:cNvGraphicFramePr>
+              <a:graphicFrameLocks noChangeAspect="1"/>
+            </wp:cNvGraphicFramePr>
+            <a:graphic>
+              <a:graphicData uri="http://schemas.openxmlformats.org/drawingml/2006/picture">
+                <pic:pic>
+                  <pic:nvPicPr>
+                    <pic:cNvPr id="0" name="diagrama_arquitectura_cloud.png"/>
+                    <pic:cNvPicPr/>
+                  </pic:nvPicPr>
+                  <pic:blipFill>
+                    <a:blip r:embed="rId10"/>
+                    <a:stretch>
+                      <a:fillRect/>
+                    </a:stretch>
+                  </pic:blipFill>
+                  <pic:spPr>
+                    <a:xfrm>
+                      <a:off x="0" y="0"/>
+                      <a:ext cx="5486400" cy="2852928"/>
+                    </a:xfrm>
+                    <a:prstGeom prst="rect"/>
+                  </pic:spPr>
+                </pic:pic>
+              </a:graphicData>
+            </a:graphic>
+          </wp:inline>
+        </w:drawing>
+      </w:r>
+    </w:p>
+    <w:p>
+      <w:pPr>
+        <w:spacing w:after="240"/>
+        <w:jc w:val="center"/>
+      </w:pPr>
+      <w:r>
+        <w:rPr>
+          <w:i/>
+          <w:color w:val="64748B"/>
+          <w:sz w:val="19"/>
+        </w:rPr>
+        <w:t>Figura: Topología de Infraestructura Segura AWS VPC, ECS Fargate y RDS PostgreSQL Multi-AZ.</w:t>
+      </w:r>
+    </w:p>
+    <w:p>
       <w:r>
         <w:rPr>
           <w:b/>
@@ -436,20 +490,20 @@
         <w:tblLook w:firstColumn="1" w:firstRow="1" w:lastColumn="0" w:lastRow="0" w:noHBand="0" w:noVBand="1" w:val="04A0"/>
       </w:tblPr>
       <w:tblGrid>
-        <w:gridCol w:w="3120"/>
-        <w:gridCol w:w="3120"/>
-        <w:gridCol w:w="3120"/>
+        <w:gridCol w:w="3216"/>
+        <w:gridCol w:w="3216"/>
+        <w:gridCol w:w="3216"/>
       </w:tblGrid>
       <w:tr>
         <w:tc>
           <w:tcPr>
-            <w:tcW w:type="dxa" w:w="3120"/>
+            <w:tcW w:type="dxa" w:w="3216"/>
             <w:shd w:fill="1E3A8A"/>
             <w:tcMar>
-              <w:top w:w="100" w:type="dxa"/>
-              <w:bottom w:w="100" w:type="dxa"/>
-              <w:left w:w="120" w:type="dxa"/>
-              <w:right w:w="120" w:type="dxa"/>
+              <w:top w:w="80" w:type="dxa"/>
+              <w:bottom w:w="80" w:type="dxa"/>
+              <w:left w:w="100" w:type="dxa"/>
+              <w:right w:w="100" w:type="dxa"/>
             </w:tcMar>
           </w:tcPr>
           <w:p>
@@ -464,13 +518,13 @@
         </w:tc>
         <w:tc>
           <w:tcPr>
-            <w:tcW w:type="dxa" w:w="3120"/>
+            <w:tcW w:type="dxa" w:w="3216"/>
             <w:shd w:fill="1E3A8A"/>
             <w:tcMar>
-              <w:top w:w="100" w:type="dxa"/>
-              <w:bottom w:w="100" w:type="dxa"/>
-              <w:left w:w="120" w:type="dxa"/>
-              <w:right w:w="120" w:type="dxa"/>
+              <w:top w:w="80" w:type="dxa"/>
+              <w:bottom w:w="80" w:type="dxa"/>
+              <w:left w:w="100" w:type="dxa"/>
+              <w:right w:w="100" w:type="dxa"/>
             </w:tcMar>
           </w:tcPr>
           <w:p>
@@ -485,13 +539,13 @@
         </w:tc>
         <w:tc>
           <w:tcPr>
-            <w:tcW w:type="dxa" w:w="3120"/>
+            <w:tcW w:type="dxa" w:w="3216"/>
             <w:shd w:fill="1E3A8A"/>
             <w:tcMar>
-              <w:top w:w="100" w:type="dxa"/>
-              <w:bottom w:w="100" w:type="dxa"/>
-              <w:left w:w="120" w:type="dxa"/>
-              <w:right w:w="120" w:type="dxa"/>
+              <w:top w:w="80" w:type="dxa"/>
+              <w:bottom w:w="80" w:type="dxa"/>
+              <w:left w:w="100" w:type="dxa"/>
+              <w:right w:w="100" w:type="dxa"/>
             </w:tcMar>
           </w:tcPr>
           <w:p>
@@ -508,13 +562,13 @@
       <w:tr>
         <w:tc>
           <w:tcPr>
-            <w:tcW w:type="dxa" w:w="3120"/>
+            <w:tcW w:type="dxa" w:w="3216"/>
             <w:shd w:fill="F8FAFC"/>
             <w:tcMar>
-              <w:top w:w="80" w:type="dxa"/>
-              <w:bottom w:w="80" w:type="dxa"/>
-              <w:left w:w="100" w:type="dxa"/>
-              <w:right w:w="100" w:type="dxa"/>
+              <w:top w:w="70" w:type="dxa"/>
+              <w:bottom w:w="70" w:type="dxa"/>
+              <w:left w:w="90" w:type="dxa"/>
+              <w:right w:w="90" w:type="dxa"/>
             </w:tcMar>
           </w:tcPr>
           <w:p>
@@ -528,13 +582,13 @@
         </w:tc>
         <w:tc>
           <w:tcPr>
-            <w:tcW w:type="dxa" w:w="3120"/>
+            <w:tcW w:type="dxa" w:w="3216"/>
             <w:shd w:fill="F8FAFC"/>
             <w:tcMar>
-              <w:top w:w="80" w:type="dxa"/>
-              <w:bottom w:w="80" w:type="dxa"/>
-              <w:left w:w="100" w:type="dxa"/>
-              <w:right w:w="100" w:type="dxa"/>
+              <w:top w:w="70" w:type="dxa"/>
+              <w:bottom w:w="70" w:type="dxa"/>
+              <w:left w:w="90" w:type="dxa"/>
+              <w:right w:w="90" w:type="dxa"/>
             </w:tcMar>
           </w:tcPr>
           <w:p>
@@ -545,13 +599,13 @@
         </w:tc>
         <w:tc>
           <w:tcPr>
-            <w:tcW w:type="dxa" w:w="3120"/>
+            <w:tcW w:type="dxa" w:w="3216"/>
             <w:shd w:fill="F8FAFC"/>
             <w:tcMar>
-              <w:top w:w="80" w:type="dxa"/>
-              <w:bottom w:w="80" w:type="dxa"/>
-              <w:left w:w="100" w:type="dxa"/>
-              <w:right w:w="100" w:type="dxa"/>
+              <w:top w:w="70" w:type="dxa"/>
+              <w:bottom w:w="70" w:type="dxa"/>
+              <w:left w:w="90" w:type="dxa"/>
+              <w:right w:w="90" w:type="dxa"/>
             </w:tcMar>
           </w:tcPr>
           <w:p>
@@ -564,13 +618,13 @@
       <w:tr>
         <w:tc>
           <w:tcPr>
-            <w:tcW w:type="dxa" w:w="3120"/>
+            <w:tcW w:type="dxa" w:w="3216"/>
             <w:shd w:fill="FFFFFF"/>
             <w:tcMar>
-              <w:top w:w="80" w:type="dxa"/>
-              <w:bottom w:w="80" w:type="dxa"/>
-              <w:left w:w="100" w:type="dxa"/>
-              <w:right w:w="100" w:type="dxa"/>
+              <w:top w:w="70" w:type="dxa"/>
+              <w:bottom w:w="70" w:type="dxa"/>
+              <w:left w:w="90" w:type="dxa"/>
+              <w:right w:w="90" w:type="dxa"/>
             </w:tcMar>
           </w:tcPr>
           <w:p>
@@ -584,13 +638,13 @@
         </w:tc>
         <w:tc>
           <w:tcPr>
-            <w:tcW w:type="dxa" w:w="3120"/>
+            <w:tcW w:type="dxa" w:w="3216"/>
             <w:shd w:fill="FFFFFF"/>
             <w:tcMar>
-              <w:top w:w="80" w:type="dxa"/>
-              <w:bottom w:w="80" w:type="dxa"/>
-              <w:left w:w="100" w:type="dxa"/>
-              <w:right w:w="100" w:type="dxa"/>
+              <w:top w:w="70" w:type="dxa"/>
+              <w:bottom w:w="70" w:type="dxa"/>
+              <w:left w:w="90" w:type="dxa"/>
+              <w:right w:w="90" w:type="dxa"/>
             </w:tcMar>
           </w:tcPr>
           <w:p>
@@ -601,13 +655,13 @@
         </w:tc>
         <w:tc>
           <w:tcPr>
-            <w:tcW w:type="dxa" w:w="3120"/>
+            <w:tcW w:type="dxa" w:w="3216"/>
             <w:shd w:fill="FFFFFF"/>
             <w:tcMar>
-              <w:top w:w="80" w:type="dxa"/>
-              <w:bottom w:w="80" w:type="dxa"/>
-              <w:left w:w="100" w:type="dxa"/>
-              <w:right w:w="100" w:type="dxa"/>
+              <w:top w:w="70" w:type="dxa"/>
+              <w:bottom w:w="70" w:type="dxa"/>
+              <w:left w:w="90" w:type="dxa"/>
+              <w:right w:w="90" w:type="dxa"/>
             </w:tcMar>
           </w:tcPr>
           <w:p>
@@ -620,13 +674,13 @@
       <w:tr>
         <w:tc>
           <w:tcPr>
-            <w:tcW w:type="dxa" w:w="3120"/>
+            <w:tcW w:type="dxa" w:w="3216"/>
             <w:shd w:fill="F8FAFC"/>
             <w:tcMar>
-              <w:top w:w="80" w:type="dxa"/>
-              <w:bottom w:w="80" w:type="dxa"/>
-              <w:left w:w="100" w:type="dxa"/>
-              <w:right w:w="100" w:type="dxa"/>
+              <w:top w:w="70" w:type="dxa"/>
+              <w:bottom w:w="70" w:type="dxa"/>
+              <w:left w:w="90" w:type="dxa"/>
+              <w:right w:w="90" w:type="dxa"/>
             </w:tcMar>
           </w:tcPr>
           <w:p>
@@ -640,13 +694,13 @@
         </w:tc>
         <w:tc>
           <w:tcPr>
-            <w:tcW w:type="dxa" w:w="3120"/>
+            <w:tcW w:type="dxa" w:w="3216"/>
             <w:shd w:fill="F8FAFC"/>
             <w:tcMar>
-              <w:top w:w="80" w:type="dxa"/>
-              <w:bottom w:w="80" w:type="dxa"/>
-              <w:left w:w="100" w:type="dxa"/>
-              <w:right w:w="100" w:type="dxa"/>
+              <w:top w:w="70" w:type="dxa"/>
+              <w:bottom w:w="70" w:type="dxa"/>
+              <w:left w:w="90" w:type="dxa"/>
+              <w:right w:w="90" w:type="dxa"/>
             </w:tcMar>
           </w:tcPr>
           <w:p>
@@ -657,13 +711,13 @@
         </w:tc>
         <w:tc>
           <w:tcPr>
-            <w:tcW w:type="dxa" w:w="3120"/>
+            <w:tcW w:type="dxa" w:w="3216"/>
             <w:shd w:fill="F8FAFC"/>
             <w:tcMar>
-              <w:top w:w="80" w:type="dxa"/>
-              <w:bottom w:w="80" w:type="dxa"/>
-              <w:left w:w="100" w:type="dxa"/>
-              <w:right w:w="100" w:type="dxa"/>
+              <w:top w:w="70" w:type="dxa"/>
+              <w:bottom w:w="70" w:type="dxa"/>
+              <w:left w:w="90" w:type="dxa"/>
+              <w:right w:w="90" w:type="dxa"/>
             </w:tcMar>
           </w:tcPr>
           <w:p>
@@ -676,13 +730,13 @@
       <w:tr>
         <w:tc>
           <w:tcPr>
-            <w:tcW w:type="dxa" w:w="3120"/>
+            <w:tcW w:type="dxa" w:w="3216"/>
             <w:shd w:fill="FFFFFF"/>
             <w:tcMar>
-              <w:top w:w="80" w:type="dxa"/>
-              <w:bottom w:w="80" w:type="dxa"/>
-              <w:left w:w="100" w:type="dxa"/>
-              <w:right w:w="100" w:type="dxa"/>
+              <w:top w:w="70" w:type="dxa"/>
+              <w:bottom w:w="70" w:type="dxa"/>
+              <w:left w:w="90" w:type="dxa"/>
+              <w:right w:w="90" w:type="dxa"/>
             </w:tcMar>
           </w:tcPr>
           <w:p>
@@ -696,13 +750,13 @@
         </w:tc>
         <w:tc>
           <w:tcPr>
-            <w:tcW w:type="dxa" w:w="3120"/>
+            <w:tcW w:type="dxa" w:w="3216"/>
             <w:shd w:fill="FFFFFF"/>
             <w:tcMar>
-              <w:top w:w="80" w:type="dxa"/>
-              <w:bottom w:w="80" w:type="dxa"/>
-              <w:left w:w="100" w:type="dxa"/>
-              <w:right w:w="100" w:type="dxa"/>
+              <w:top w:w="70" w:type="dxa"/>
+              <w:bottom w:w="70" w:type="dxa"/>
+              <w:left w:w="90" w:type="dxa"/>
+              <w:right w:w="90" w:type="dxa"/>
             </w:tcMar>
           </w:tcPr>
           <w:p>
@@ -713,13 +767,13 @@
         </w:tc>
         <w:tc>
           <w:tcPr>
-            <w:tcW w:type="dxa" w:w="3120"/>
+            <w:tcW w:type="dxa" w:w="3216"/>
             <w:shd w:fill="FFFFFF"/>
             <w:tcMar>
-              <w:top w:w="80" w:type="dxa"/>
-              <w:bottom w:w="80" w:type="dxa"/>
-              <w:left w:w="100" w:type="dxa"/>
-              <w:right w:w="100" w:type="dxa"/>
+              <w:top w:w="70" w:type="dxa"/>
+              <w:bottom w:w="70" w:type="dxa"/>
+              <w:left w:w="90" w:type="dxa"/>
+              <w:right w:w="90" w:type="dxa"/>
             </w:tcMar>
           </w:tcPr>
           <w:p>
@@ -732,13 +786,13 @@
       <w:tr>
         <w:tc>
           <w:tcPr>
-            <w:tcW w:type="dxa" w:w="3120"/>
+            <w:tcW w:type="dxa" w:w="3216"/>
             <w:shd w:fill="F8FAFC"/>
             <w:tcMar>
-              <w:top w:w="80" w:type="dxa"/>
-              <w:bottom w:w="80" w:type="dxa"/>
-              <w:left w:w="100" w:type="dxa"/>
-              <w:right w:w="100" w:type="dxa"/>
+              <w:top w:w="70" w:type="dxa"/>
+              <w:bottom w:w="70" w:type="dxa"/>
+              <w:left w:w="90" w:type="dxa"/>
+              <w:right w:w="90" w:type="dxa"/>
             </w:tcMar>
           </w:tcPr>
           <w:p>
@@ -752,13 +806,13 @@
         </w:tc>
         <w:tc>
           <w:tcPr>
-            <w:tcW w:type="dxa" w:w="3120"/>
+            <w:tcW w:type="dxa" w:w="3216"/>
             <w:shd w:fill="F8FAFC"/>
             <w:tcMar>
-              <w:top w:w="80" w:type="dxa"/>
-              <w:bottom w:w="80" w:type="dxa"/>
-              <w:left w:w="100" w:type="dxa"/>
-              <w:right w:w="100" w:type="dxa"/>
+              <w:top w:w="70" w:type="dxa"/>
+              <w:bottom w:w="70" w:type="dxa"/>
+              <w:left w:w="90" w:type="dxa"/>
+              <w:right w:w="90" w:type="dxa"/>
             </w:tcMar>
           </w:tcPr>
           <w:p>
@@ -769,13 +823,13 @@
         </w:tc>
         <w:tc>
           <w:tcPr>
-            <w:tcW w:type="dxa" w:w="3120"/>
+            <w:tcW w:type="dxa" w:w="3216"/>
             <w:shd w:fill="F8FAFC"/>
             <w:tcMar>
-              <w:top w:w="80" w:type="dxa"/>
-              <w:bottom w:w="80" w:type="dxa"/>
-              <w:left w:w="100" w:type="dxa"/>
-              <w:right w:w="100" w:type="dxa"/>
+              <w:top w:w="70" w:type="dxa"/>
+              <w:bottom w:w="70" w:type="dxa"/>
+              <w:left w:w="90" w:type="dxa"/>
+              <w:right w:w="90" w:type="dxa"/>
             </w:tcMar>
           </w:tcPr>
           <w:p>
@@ -802,6 +856,60 @@
         <w:t>5. Esquema del Ciclo de Vida del Proyecto (1 Entregable Clave por Fase)</w:t>
       </w:r>
     </w:p>
+    <w:p>
+      <w:pPr>
+        <w:spacing w:before="160" w:after="80"/>
+        <w:jc w:val="center"/>
+      </w:pPr>
+      <w:r>
+        <w:drawing>
+          <wp:inline xmlns:a="http://schemas.openxmlformats.org/drawingml/2006/main" xmlns:pic="http://schemas.openxmlformats.org/drawingml/2006/picture">
+            <wp:extent cx="5486400" cy="2194560"/>
+            <wp:docPr id="3" name="Picture 3"/>
+            <wp:cNvGraphicFramePr>
+              <a:graphicFrameLocks noChangeAspect="1"/>
+            </wp:cNvGraphicFramePr>
+            <a:graphic>
+              <a:graphicData uri="http://schemas.openxmlformats.org/drawingml/2006/picture">
+                <pic:pic>
+                  <pic:nvPicPr>
+                    <pic:cNvPr id="0" name="diagrama_ciclo_vida.png"/>
+                    <pic:cNvPicPr/>
+                  </pic:nvPicPr>
+                  <pic:blipFill>
+                    <a:blip r:embed="rId11"/>
+                    <a:stretch>
+                      <a:fillRect/>
+                    </a:stretch>
+                  </pic:blipFill>
+                  <pic:spPr>
+                    <a:xfrm>
+                      <a:off x="0" y="0"/>
+                      <a:ext cx="5486400" cy="2194560"/>
+                    </a:xfrm>
+                    <a:prstGeom prst="rect"/>
+                  </pic:spPr>
+                </pic:pic>
+              </a:graphicData>
+            </a:graphic>
+          </wp:inline>
+        </w:drawing>
+      </w:r>
+    </w:p>
+    <w:p>
+      <w:pPr>
+        <w:spacing w:after="240"/>
+        <w:jc w:val="center"/>
+      </w:pPr>
+      <w:r>
+        <w:rPr>
+          <w:i/>
+          <w:color w:val="64748B"/>
+          <w:sz w:val="19"/>
+        </w:rPr>
+        <w:t>Figura: Ciclo de Vida de 5 Fases con 1 Entregable Formal Obligatorio por Fase.</w:t>
+      </w:r>
+    </w:p>
     <w:tbl>
       <w:tblPr>
         <w:tblW w:type="auto" w:w="0"/>
@@ -809,20 +917,20 @@
         <w:tblLook w:firstColumn="1" w:firstRow="1" w:lastColumn="0" w:lastRow="0" w:noHBand="0" w:noVBand="1" w:val="04A0"/>
       </w:tblPr>
       <w:tblGrid>
-        <w:gridCol w:w="3120"/>
-        <w:gridCol w:w="3120"/>
-        <w:gridCol w:w="3120"/>
+        <w:gridCol w:w="3216"/>
+        <w:gridCol w:w="3216"/>
+        <w:gridCol w:w="3216"/>
       </w:tblGrid>
       <w:tr>
         <w:tc>
           <w:tcPr>
-            <w:tcW w:type="dxa" w:w="3120"/>
+            <w:tcW w:type="dxa" w:w="3216"/>
             <w:shd w:fill="0F766E"/>
             <w:tcMar>
-              <w:top w:w="100" w:type="dxa"/>
-              <w:bottom w:w="100" w:type="dxa"/>
-              <w:left w:w="120" w:type="dxa"/>
-              <w:right w:w="120" w:type="dxa"/>
+              <w:top w:w="80" w:type="dxa"/>
+              <w:bottom w:w="80" w:type="dxa"/>
+              <w:left w:w="100" w:type="dxa"/>
+              <w:right w:w="100" w:type="dxa"/>
             </w:tcMar>
           </w:tcPr>
           <w:p>
@@ -837,13 +945,13 @@
         </w:tc>
         <w:tc>
           <w:tcPr>
-            <w:tcW w:type="dxa" w:w="3120"/>
+            <w:tcW w:type="dxa" w:w="3216"/>
             <w:shd w:fill="0F766E"/>
             <w:tcMar>
-              <w:top w:w="100" w:type="dxa"/>
-              <w:bottom w:w="100" w:type="dxa"/>
-              <w:left w:w="120" w:type="dxa"/>
-              <w:right w:w="120" w:type="dxa"/>
+              <w:top w:w="80" w:type="dxa"/>
+              <w:bottom w:w="80" w:type="dxa"/>
+              <w:left w:w="100" w:type="dxa"/>
+              <w:right w:w="100" w:type="dxa"/>
             </w:tcMar>
           </w:tcPr>
           <w:p>
@@ -858,13 +966,13 @@
         </w:tc>
         <w:tc>
           <w:tcPr>
-            <w:tcW w:type="dxa" w:w="3120"/>
+            <w:tcW w:type="dxa" w:w="3216"/>
             <w:shd w:fill="0F766E"/>
             <w:tcMar>
-              <w:top w:w="100" w:type="dxa"/>
-              <w:bottom w:w="100" w:type="dxa"/>
-              <w:left w:w="120" w:type="dxa"/>
-              <w:right w:w="120" w:type="dxa"/>
+              <w:top w:w="80" w:type="dxa"/>
+              <w:bottom w:w="80" w:type="dxa"/>
+              <w:left w:w="100" w:type="dxa"/>
+              <w:right w:w="100" w:type="dxa"/>
             </w:tcMar>
           </w:tcPr>
           <w:p>
@@ -881,13 +989,13 @@
       <w:tr>
         <w:tc>
           <w:tcPr>
-            <w:tcW w:type="dxa" w:w="3120"/>
+            <w:tcW w:type="dxa" w:w="3216"/>
             <w:shd w:fill="F0FDF4"/>
             <w:tcMar>
-              <w:top w:w="80" w:type="dxa"/>
-              <w:bottom w:w="80" w:type="dxa"/>
-              <w:left w:w="100" w:type="dxa"/>
-              <w:right w:w="100" w:type="dxa"/>
+              <w:top w:w="70" w:type="dxa"/>
+              <w:bottom w:w="70" w:type="dxa"/>
+              <w:left w:w="90" w:type="dxa"/>
+              <w:right w:w="90" w:type="dxa"/>
             </w:tcMar>
           </w:tcPr>
           <w:p>
@@ -901,13 +1009,13 @@
         </w:tc>
         <w:tc>
           <w:tcPr>
-            <w:tcW w:type="dxa" w:w="3120"/>
+            <w:tcW w:type="dxa" w:w="3216"/>
             <w:shd w:fill="F0FDF4"/>
             <w:tcMar>
-              <w:top w:w="80" w:type="dxa"/>
-              <w:bottom w:w="80" w:type="dxa"/>
-              <w:left w:w="100" w:type="dxa"/>
-              <w:right w:w="100" w:type="dxa"/>
+              <w:top w:w="70" w:type="dxa"/>
+              <w:bottom w:w="70" w:type="dxa"/>
+              <w:left w:w="90" w:type="dxa"/>
+              <w:right w:w="90" w:type="dxa"/>
             </w:tcMar>
           </w:tcPr>
           <w:p>
@@ -918,13 +1026,13 @@
         </w:tc>
         <w:tc>
           <w:tcPr>
-            <w:tcW w:type="dxa" w:w="3120"/>
+            <w:tcW w:type="dxa" w:w="3216"/>
             <w:shd w:fill="F0FDF4"/>
             <w:tcMar>
-              <w:top w:w="80" w:type="dxa"/>
-              <w:bottom w:w="80" w:type="dxa"/>
-              <w:left w:w="100" w:type="dxa"/>
-              <w:right w:w="100" w:type="dxa"/>
+              <w:top w:w="70" w:type="dxa"/>
+              <w:bottom w:w="70" w:type="dxa"/>
+              <w:left w:w="90" w:type="dxa"/>
+              <w:right w:w="90" w:type="dxa"/>
             </w:tcMar>
           </w:tcPr>
           <w:p>
@@ -941,13 +1049,13 @@
       <w:tr>
         <w:tc>
           <w:tcPr>
-            <w:tcW w:type="dxa" w:w="3120"/>
+            <w:tcW w:type="dxa" w:w="3216"/>
             <w:shd w:fill="FFFFFF"/>
             <w:tcMar>
-              <w:top w:w="80" w:type="dxa"/>
-              <w:bottom w:w="80" w:type="dxa"/>
-              <w:left w:w="100" w:type="dxa"/>
-              <w:right w:w="100" w:type="dxa"/>
+              <w:top w:w="70" w:type="dxa"/>
+              <w:bottom w:w="70" w:type="dxa"/>
+              <w:left w:w="90" w:type="dxa"/>
+              <w:right w:w="90" w:type="dxa"/>
             </w:tcMar>
           </w:tcPr>
           <w:p>
@@ -961,13 +1069,13 @@
         </w:tc>
         <w:tc>
           <w:tcPr>
-            <w:tcW w:type="dxa" w:w="3120"/>
+            <w:tcW w:type="dxa" w:w="3216"/>
             <w:shd w:fill="FFFFFF"/>
             <w:tcMar>
-              <w:top w:w="80" w:type="dxa"/>
-              <w:bottom w:w="80" w:type="dxa"/>
-              <w:left w:w="100" w:type="dxa"/>
-              <w:right w:w="100" w:type="dxa"/>
+              <w:top w:w="70" w:type="dxa"/>
+              <w:bottom w:w="70" w:type="dxa"/>
+              <w:left w:w="90" w:type="dxa"/>
+              <w:right w:w="90" w:type="dxa"/>
             </w:tcMar>
           </w:tcPr>
           <w:p>
@@ -978,13 +1086,13 @@
         </w:tc>
         <w:tc>
           <w:tcPr>
-            <w:tcW w:type="dxa" w:w="3120"/>
+            <w:tcW w:type="dxa" w:w="3216"/>
             <w:shd w:fill="FFFFFF"/>
             <w:tcMar>
-              <w:top w:w="80" w:type="dxa"/>
-              <w:bottom w:w="80" w:type="dxa"/>
-              <w:left w:w="100" w:type="dxa"/>
-              <w:right w:w="100" w:type="dxa"/>
+              <w:top w:w="70" w:type="dxa"/>
+              <w:bottom w:w="70" w:type="dxa"/>
+              <w:left w:w="90" w:type="dxa"/>
+              <w:right w:w="90" w:type="dxa"/>
             </w:tcMar>
           </w:tcPr>
           <w:p>
@@ -1001,13 +1109,13 @@
       <w:tr>
         <w:tc>
           <w:tcPr>
-            <w:tcW w:type="dxa" w:w="3120"/>
+            <w:tcW w:type="dxa" w:w="3216"/>
             <w:shd w:fill="F0FDF4"/>
             <w:tcMar>
-              <w:top w:w="80" w:type="dxa"/>
-              <w:bottom w:w="80" w:type="dxa"/>
-              <w:left w:w="100" w:type="dxa"/>
-              <w:right w:w="100" w:type="dxa"/>
+              <w:top w:w="70" w:type="dxa"/>
+              <w:bottom w:w="70" w:type="dxa"/>
+              <w:left w:w="90" w:type="dxa"/>
+              <w:right w:w="90" w:type="dxa"/>
             </w:tcMar>
           </w:tcPr>
           <w:p>
@@ -1021,13 +1129,13 @@
         </w:tc>
         <w:tc>
           <w:tcPr>
-            <w:tcW w:type="dxa" w:w="3120"/>
+            <w:tcW w:type="dxa" w:w="3216"/>
             <w:shd w:fill="F0FDF4"/>
             <w:tcMar>
-              <w:top w:w="80" w:type="dxa"/>
-              <w:bottom w:w="80" w:type="dxa"/>
-              <w:left w:w="100" w:type="dxa"/>
-              <w:right w:w="100" w:type="dxa"/>
+              <w:top w:w="70" w:type="dxa"/>
+              <w:bottom w:w="70" w:type="dxa"/>
+              <w:left w:w="90" w:type="dxa"/>
+              <w:right w:w="90" w:type="dxa"/>
             </w:tcMar>
           </w:tcPr>
           <w:p>
@@ -1038,13 +1146,13 @@
         </w:tc>
         <w:tc>
           <w:tcPr>
-            <w:tcW w:type="dxa" w:w="3120"/>
+            <w:tcW w:type="dxa" w:w="3216"/>
             <w:shd w:fill="F0FDF4"/>
             <w:tcMar>
-              <w:top w:w="80" w:type="dxa"/>
-              <w:bottom w:w="80" w:type="dxa"/>
-              <w:left w:w="100" w:type="dxa"/>
-              <w:right w:w="100" w:type="dxa"/>
+              <w:top w:w="70" w:type="dxa"/>
+              <w:bottom w:w="70" w:type="dxa"/>
+              <w:left w:w="90" w:type="dxa"/>
+              <w:right w:w="90" w:type="dxa"/>
             </w:tcMar>
           </w:tcPr>
           <w:p>
@@ -1061,13 +1169,13 @@
       <w:tr>
         <w:tc>
           <w:tcPr>
-            <w:tcW w:type="dxa" w:w="3120"/>
+            <w:tcW w:type="dxa" w:w="3216"/>
             <w:shd w:fill="FFFFFF"/>
             <w:tcMar>
-              <w:top w:w="80" w:type="dxa"/>
-              <w:bottom w:w="80" w:type="dxa"/>
-              <w:left w:w="100" w:type="dxa"/>
-              <w:right w:w="100" w:type="dxa"/>
+              <w:top w:w="70" w:type="dxa"/>
+              <w:bottom w:w="70" w:type="dxa"/>
+              <w:left w:w="90" w:type="dxa"/>
+              <w:right w:w="90" w:type="dxa"/>
             </w:tcMar>
           </w:tcPr>
           <w:p>
@@ -1081,13 +1189,13 @@
         </w:tc>
         <w:tc>
           <w:tcPr>
-            <w:tcW w:type="dxa" w:w="3120"/>
+            <w:tcW w:type="dxa" w:w="3216"/>
             <w:shd w:fill="FFFFFF"/>
             <w:tcMar>
-              <w:top w:w="80" w:type="dxa"/>
-              <w:bottom w:w="80" w:type="dxa"/>
-              <w:left w:w="100" w:type="dxa"/>
-              <w:right w:w="100" w:type="dxa"/>
+              <w:top w:w="70" w:type="dxa"/>
+              <w:bottom w:w="70" w:type="dxa"/>
+              <w:left w:w="90" w:type="dxa"/>
+              <w:right w:w="90" w:type="dxa"/>
             </w:tcMar>
           </w:tcPr>
           <w:p>
@@ -1098,13 +1206,13 @@
         </w:tc>
         <w:tc>
           <w:tcPr>
-            <w:tcW w:type="dxa" w:w="3120"/>
+            <w:tcW w:type="dxa" w:w="3216"/>
             <w:shd w:fill="FFFFFF"/>
             <w:tcMar>
-              <w:top w:w="80" w:type="dxa"/>
-              <w:bottom w:w="80" w:type="dxa"/>
-              <w:left w:w="100" w:type="dxa"/>
-              <w:right w:w="100" w:type="dxa"/>
+              <w:top w:w="70" w:type="dxa"/>
+              <w:bottom w:w="70" w:type="dxa"/>
+              <w:left w:w="90" w:type="dxa"/>
+              <w:right w:w="90" w:type="dxa"/>
             </w:tcMar>
           </w:tcPr>
           <w:p>
@@ -1121,13 +1229,13 @@
       <w:tr>
         <w:tc>
           <w:tcPr>
-            <w:tcW w:type="dxa" w:w="3120"/>
+            <w:tcW w:type="dxa" w:w="3216"/>
             <w:shd w:fill="F0FDF4"/>
             <w:tcMar>
-              <w:top w:w="80" w:type="dxa"/>
-              <w:bottom w:w="80" w:type="dxa"/>
-              <w:left w:w="100" w:type="dxa"/>
-              <w:right w:w="100" w:type="dxa"/>
+              <w:top w:w="70" w:type="dxa"/>
+              <w:bottom w:w="70" w:type="dxa"/>
+              <w:left w:w="90" w:type="dxa"/>
+              <w:right w:w="90" w:type="dxa"/>
             </w:tcMar>
           </w:tcPr>
           <w:p>
@@ -1141,13 +1249,13 @@
         </w:tc>
         <w:tc>
           <w:tcPr>
-            <w:tcW w:type="dxa" w:w="3120"/>
+            <w:tcW w:type="dxa" w:w="3216"/>
             <w:shd w:fill="F0FDF4"/>
             <w:tcMar>
-              <w:top w:w="80" w:type="dxa"/>
-              <w:bottom w:w="80" w:type="dxa"/>
-              <w:left w:w="100" w:type="dxa"/>
-              <w:right w:w="100" w:type="dxa"/>
+              <w:top w:w="70" w:type="dxa"/>
+              <w:bottom w:w="70" w:type="dxa"/>
+              <w:left w:w="90" w:type="dxa"/>
+              <w:right w:w="90" w:type="dxa"/>
             </w:tcMar>
           </w:tcPr>
           <w:p>
@@ -1158,13 +1266,13 @@
         </w:tc>
         <w:tc>
           <w:tcPr>
-            <w:tcW w:type="dxa" w:w="3120"/>
+            <w:tcW w:type="dxa" w:w="3216"/>
             <w:shd w:fill="F0FDF4"/>
             <w:tcMar>
-              <w:top w:w="80" w:type="dxa"/>
-              <w:bottom w:w="80" w:type="dxa"/>
-              <w:left w:w="100" w:type="dxa"/>
-              <w:right w:w="100" w:type="dxa"/>
+              <w:top w:w="70" w:type="dxa"/>
+              <w:bottom w:w="70" w:type="dxa"/>
+              <w:left w:w="90" w:type="dxa"/>
+              <w:right w:w="90" w:type="dxa"/>
             </w:tcMar>
           </w:tcPr>
           <w:p>
@@ -1196,8 +1304,57 @@
       </w:r>
     </w:p>
     <w:p>
+      <w:pPr>
+        <w:spacing w:before="160" w:after="80"/>
+        <w:jc w:val="center"/>
+      </w:pPr>
       <w:r>
-        <w:t>La plataforma web desarrollada (PrestaFast) opera bajo un flujo transaccional continuo de 4 pasos sin recargas de página, optimizado para celulares y computadoras:</w:t>
+        <w:drawing>
+          <wp:inline xmlns:a="http://schemas.openxmlformats.org/drawingml/2006/main" xmlns:pic="http://schemas.openxmlformats.org/drawingml/2006/picture">
+            <wp:extent cx="5486400" cy="1975104"/>
+            <wp:docPr id="4" name="Picture 4"/>
+            <wp:cNvGraphicFramePr>
+              <a:graphicFrameLocks noChangeAspect="1"/>
+            </wp:cNvGraphicFramePr>
+            <a:graphic>
+              <a:graphicData uri="http://schemas.openxmlformats.org/drawingml/2006/picture">
+                <pic:pic>
+                  <pic:nvPicPr>
+                    <pic:cNvPr id="0" name="diagrama_flujo_app.png"/>
+                    <pic:cNvPicPr/>
+                  </pic:nvPicPr>
+                  <pic:blipFill>
+                    <a:blip r:embed="rId12"/>
+                    <a:stretch>
+                      <a:fillRect/>
+                    </a:stretch>
+                  </pic:blipFill>
+                  <pic:spPr>
+                    <a:xfrm>
+                      <a:off x="0" y="0"/>
+                      <a:ext cx="5486400" cy="1975104"/>
+                    </a:xfrm>
+                    <a:prstGeom prst="rect"/>
+                  </pic:spPr>
+                </pic:pic>
+              </a:graphicData>
+            </a:graphic>
+          </wp:inline>
+        </w:drawing>
+      </w:r>
+    </w:p>
+    <w:p>
+      <w:pPr>
+        <w:spacing w:after="240"/>
+        <w:jc w:val="center"/>
+      </w:pPr>
+      <w:r>
+        <w:rPr>
+          <w:i/>
+          <w:color w:val="64748B"/>
+          <w:sz w:val="19"/>
+        </w:rPr>
+        <w:t>Figura: Flujo Operativo de la Aplicación Móvil en 5 Pasos Transaccionales.</w:t>
       </w:r>
     </w:p>
     <w:p>
@@ -1262,29 +1419,16 @@
           <w:b/>
           <w:color w:val="2563EB"/>
         </w:rPr>
-        <w:t>• Pantalla de Comprobante Oficial:</w:t>
+        <w:t>• Paso 5 - Pantalla de Comprobante Oficial y Auditoría Cloud:</w:t>
         <w:br/>
       </w:r>
       <w:r>
-        <w:t>Se genera un ticket bancario con N° de Operación único (ej. OP-948102), fecha y hora exacta, datos del titular y Hash Criptográfico en la Nube. Incluye botón para Descargar o Imprimir el Comprobante en PDF.</w:t>
+        <w:t>Se genera un ticket bancario con N° de Operación único (ej. OP-948102), fecha y hora exacta, datos del titular y Hash Criptográfico en la Nube. Incluye botón para Descargar o Imprimir el Comprobante en PDF, y la operación se refleja inmediatamente en la consola de AWS RDS inferior.</w:t>
       </w:r>
     </w:p>
     <w:p>
       <w:r>
-        <w:rPr>
-          <w:b/>
-          <w:color w:val="2563EB"/>
-        </w:rPr>
-        <w:t>• Consola de Monitoreo Cloud en Tiempo Real:</w:t>
-        <w:br/>
-      </w:r>
-      <w:r>
-        <w:t>En la sección inferior, la tabla de auditoría en vivo muestra inmediatamente la nueva transacción registrada en AWS RDS PostgreSQL junto con las métricas de estado (Online Multi-AZ y cifrado KMS).</w:t>
-      </w:r>
-    </w:p>
-    <w:p>
-      <w:r>
-        <w:br/>
+        <w:br w:type="page"/>
       </w:r>
     </w:p>
     <w:p>
@@ -1296,6 +1440,60 @@
           <w:color w:val="1E3A8A"/>
         </w:rPr>
         <w:t>7. Plan Técnico de Migración de Base de Datos y Validación por Checksums</w:t>
+      </w:r>
+    </w:p>
+    <w:p>
+      <w:pPr>
+        <w:spacing w:before="160" w:after="80"/>
+        <w:jc w:val="center"/>
+      </w:pPr>
+      <w:r>
+        <w:drawing>
+          <wp:inline xmlns:a="http://schemas.openxmlformats.org/drawingml/2006/main" xmlns:pic="http://schemas.openxmlformats.org/drawingml/2006/picture">
+            <wp:extent cx="5486400" cy="1975104"/>
+            <wp:docPr id="5" name="Picture 5"/>
+            <wp:cNvGraphicFramePr>
+              <a:graphicFrameLocks noChangeAspect="1"/>
+            </wp:cNvGraphicFramePr>
+            <a:graphic>
+              <a:graphicData uri="http://schemas.openxmlformats.org/drawingml/2006/picture">
+                <pic:pic>
+                  <pic:nvPicPr>
+                    <pic:cNvPr id="0" name="diagrama_migracion_bd.png"/>
+                    <pic:cNvPicPr/>
+                  </pic:nvPicPr>
+                  <pic:blipFill>
+                    <a:blip r:embed="rId13"/>
+                    <a:stretch>
+                      <a:fillRect/>
+                    </a:stretch>
+                  </pic:blipFill>
+                  <pic:spPr>
+                    <a:xfrm>
+                      <a:off x="0" y="0"/>
+                      <a:ext cx="5486400" cy="1975104"/>
+                    </a:xfrm>
+                    <a:prstGeom prst="rect"/>
+                  </pic:spPr>
+                </pic:pic>
+              </a:graphicData>
+            </a:graphic>
+          </wp:inline>
+        </w:drawing>
+      </w:r>
+    </w:p>
+    <w:p>
+      <w:pPr>
+        <w:spacing w:after="240"/>
+        <w:jc w:val="center"/>
+      </w:pPr>
+      <w:r>
+        <w:rPr>
+          <w:i/>
+          <w:color w:val="64748B"/>
+          <w:sz w:val="19"/>
+        </w:rPr>
+        <w:t>Figura: Estrategia Técnica de Migración Replatform con Verificación por Checksums SHA-256.</w:t>
       </w:r>
     </w:p>
     <w:p>
@@ -1324,7 +1522,7 @@
         <w:rPr>
           <w:color w:val="1E3A8A"/>
         </w:rPr>
-        <w:t>8. Enlaces de Acceso y Conclusiones</w:t>
+        <w:t>8. Enlaces Oficiales de Consulta</w:t>
       </w:r>
     </w:p>
     <w:p>
@@ -1350,7 +1548,7 @@
     </w:p>
     <w:sectPr>
       <w:pgSz w:w="12240" w:h="15840"/>
-      <w:pgMar w:top="1440" w:right="1440" w:bottom="1440" w:left="1440" w:header="720" w:footer="720" w:gutter="0"/>
+      <w:pgMar w:top="1296" w:right="1296" w:bottom="1296" w:left="1296" w:header="720" w:footer="720" w:gutter="0"/>
       <w:cols w:space="720"/>
       <w:docGrid w:linePitch="360"/>
     </w:sectPr>

</xml_diff>